<commit_message>
Renombra el proyecto de VetRisk a PreVet
El nombre anterior ponia la palabra "riesgo" en el producto, cuando el
riesgo es lo que el sistema gestiona y no lo que ofrece. PreVet combina
"prever" y "veterinaria", que es exactamente la promesa del sistema.

Actualiza el nombre en el informe tecnico, la guia de definicion, la
presentacion, el diario de reflexion de Uciell y el README.
</commit_message>
<xml_diff>
--- a/Fase 1/Evidencias Grupales/1.4_APT122_FormativaFase1.docx
+++ b/Fase 1/Evidencias Grupales/1.4_APT122_FormativaFase1.docx
@@ -58,7 +58,7 @@
           <w:i w:val="0"/>
           <w:sz w:val="60"/>
         </w:rPr>
-        <w:t>VetRisk</w:t>
+        <w:t>PreVet</w:t>
       </w:r>
     </w:p>
     <w:p>
@@ -358,7 +358,7 @@
           <w:i w:val="0"/>
           <w:sz w:val="22"/>
         </w:rPr>
-        <w:t>Las clínicas veterinarias de menor tamaño gestionan sus horas de atención mediante canales informales —llamada telefónica, WhatsApp e Instagram—, lo que impide registrar de forma estructurada la información de su agenda. Como consecuencia, la inasistencia de clientes a las horas reservadas no puede ser medida ni gestionada, generando pérdidas operacionales y económicas que la organización no logra cuantificar. Este proyecto propone el desarrollo de VetRisk, un módulo de análisis predictivo construido como extensión del sistema de gestión veterinaria Huellitas, que estructura los datos del proceso de agendamiento, construye indicadores de gestión y estima la probabilidad de inasistencia de cada hora agendada, entregando a la clínica un tablero con las horas en riesgo y una acción recomendada para cada una. El componente innovador reside en el traslado de los modelos de predicción de inasistencia, validados en el ámbito de la salud humana, a un sector que no los ha incorporado: la totalidad de las soluciones disponibles en el mercado chileno responde al problema mediante recordatorios uniformes, sin diferenciar el riesgo de cada reserva. El proyecto se desarrolla bajo la metodología CRISP-DM, complementada con un marco ágil de gestión, y se sitúa en clínicas veterinarias de las localidades de Lo Pinto y Batuco, Región Metropolitana.</w:t>
+        <w:t>Las clínicas veterinarias de menor tamaño gestionan sus horas de atención mediante canales informales —llamada telefónica, WhatsApp e Instagram—, lo que impide registrar de forma estructurada la información de su agenda. Como consecuencia, la inasistencia de clientes a las horas reservadas no puede ser medida ni gestionada, generando pérdidas operacionales y económicas que la organización no logra cuantificar. Este proyecto propone el desarrollo de PreVet, un módulo de análisis predictivo construido como extensión del sistema de gestión veterinaria Huellitas, que estructura los datos del proceso de agendamiento, construye indicadores de gestión y estima la probabilidad de inasistencia de cada hora agendada, entregando a la clínica un tablero con las horas en riesgo y una acción recomendada para cada una. El componente innovador reside en el traslado de los modelos de predicción de inasistencia, validados en el ámbito de la salud humana, a un sector que no los ha incorporado: la totalidad de las soluciones disponibles en el mercado chileno responde al problema mediante recordatorios uniformes, sin diferenciar el riesgo de cada reserva. El proyecto se desarrolla bajo la metodología CRISP-DM, complementada con un marco ágil de gestión, y se sitúa en clínicas veterinarias de las localidades de Lo Pinto y Batuco, Región Metropolitana.</w:t>
       </w:r>
     </w:p>
     <w:p>
@@ -392,7 +392,7 @@
           <w:i w:val="0"/>
           <w:sz w:val="22"/>
         </w:rPr>
-        <w:t>Small veterinary clinics manage their appointments through informal channels —phone calls, WhatsApp and Instagram— which prevents them from recording scheduling information in a structured way. As a result, client no-shows cannot be measured or managed, producing operational and financial losses that the organisation is unable to quantify. This project proposes the development of VetRisk, a predictive analytics module built as an extension of the Huellitas veterinary management system, which structures the scheduling process data, builds management indicators and estimates the probability of non-attendance for each booked appointment, providing the clinic with a dashboard displaying at-risk appointments together with a recommended action for each one. The innovative component lies in transferring no-show prediction models, already validated in human healthcare, to a sector that has not yet adopted them: every solution available in the Chilean market addresses the problem through uniform reminders, without differentiating the risk of each booking. The project follows the CRISP-DM methodology, complemented by an agile management framework, and is situated in veterinary clinics located in Lo Pinto and Batuco, Metropolitan Region of Chile.</w:t>
+        <w:t>Small veterinary clinics manage their appointments through informal channels —phone calls, WhatsApp and Instagram— which prevents them from recording scheduling information in a structured way. As a result, client no-shows cannot be measured or managed, producing operational and financial losses that the organisation is unable to quantify. This project proposes the development of PreVet, a predictive analytics module built as an extension of the Huellitas veterinary management system, which structures the scheduling process data, builds management indicators and estimates the probability of non-attendance for each booked appointment, providing the clinic with a dashboard displaying at-risk appointments together with a recommended action for each one. The innovative component lies in transferring no-show prediction models, already validated in human healthcare, to a sector that has not yet adopted them: every solution available in the Chilean market addresses the problem through uniform reminders, without differentiating the risk of each booking. The project follows the CRISP-DM methodology, complemented by an agile management framework, and is situated in veterinary clinics located in Lo Pinto and Batuco, Metropolitan Region of Chile.</w:t>
       </w:r>
     </w:p>
     <w:p>
@@ -872,7 +872,7 @@
           <w:i w:val="0"/>
           <w:sz w:val="22"/>
         </w:rPr>
-        <w:t>El análisis de ese sistema base revela con precisión la carencia que este proyecto aborda. El modelo de citas contempla únicamente tres estados —pendiente, completada y cancelada—, sin ninguno que registre la inasistencia. Cuando un tutor no se presenta, la cita permanece indefinidamente como pendiente: no fue completada, pero tampoco cancelada. En consecuencia, el sistema no puede contabilizar las inasistencias, y su módulo de reportes, que presenta consultas por mes y distribución de pacientes por especie, tampoco las considera. El sistema base gestiona la agenda, pero es incapaz de medir su pérdida. Esa es exactamente la brecha que VetRisk viene a cerrar.</w:t>
+        <w:t>El análisis de ese sistema base revela con precisión la carencia que este proyecto aborda. El modelo de citas contempla únicamente tres estados —pendiente, completada y cancelada—, sin ninguno que registre la inasistencia. Cuando un tutor no se presenta, la cita permanece indefinidamente como pendiente: no fue completada, pero tampoco cancelada. En consecuencia, el sistema no puede contabilizar las inasistencias, y su módulo de reportes, que presenta consultas por mes y distribución de pacientes por especie, tampoco las considera. El sistema base gestiona la agenda, pero es incapaz de medir su pérdida. Esa es exactamente la brecha que PreVet viene a cerrar.</w:t>
       </w:r>
     </w:p>
     <w:p>
@@ -964,7 +964,7 @@
                 <w:b/>
                 <w:sz w:val="19"/>
               </w:rPr>
-              <w:t>Propuesta VetRisk</w:t>
+              <w:t>Propuesta PreVet</w:t>
             </w:r>
           </w:p>
         </w:tc>
@@ -1193,7 +1193,7 @@
           <w:i w:val="0"/>
           <w:sz w:val="22"/>
         </w:rPr>
-        <w:t>VetRisk se desarrolla en cinco etapas sucesivas, cada una de las cuales resuelve una carencia concreta del proceso actual:</w:t>
+        <w:t>PreVet se desarrolla en cinco etapas sucesivas, cada una de las cuales resuelve una carencia concreta del proceso actual:</w:t>
       </w:r>
     </w:p>
     <w:p>

</xml_diff>